<commit_message>
adds more details for having R, Rstudio, Git, and creating and connecting to project on local computer
</commit_message>
<xml_diff>
--- a/Instructions_UpdatingFiles_EachYear.docx
+++ b/Instructions_UpdatingFiles_EachYear.docx
@@ -20,107 +20,69 @@
     </w:p>
     <w:p>
       <w:pPr>
-        <w:ind w:left="720" w:hanging="360"/>
-      </w:pPr>
-      <w:r>
-        <w:t xml:space="preserve">Have R. </w:t>
-      </w:r>
-    </w:p>
-    <w:p>
-      <w:pPr>
-        <w:ind w:left="720" w:hanging="360"/>
-      </w:pPr>
-      <w:r>
-        <w:t xml:space="preserve">Have a GitHub Account. </w:t>
-      </w:r>
-    </w:p>
-    <w:p>
-      <w:pPr>
-        <w:ind w:left="720" w:hanging="360"/>
-      </w:pPr>
-      <w:r>
-        <w:t>Connect to GitHub</w:t>
-      </w:r>
-      <w:r>
-        <w:t xml:space="preserve"> </w:t>
-      </w:r>
-      <w:r>
-        <w:t>with SSH</w:t>
-      </w:r>
-    </w:p>
-    <w:p>
-      <w:pPr>
         <w:pStyle w:val="ListParagraph"/>
         <w:numPr>
           <w:ilvl w:val="0"/>
-          <w:numId w:val="2"/>
+          <w:numId w:val="4"/>
         </w:numPr>
       </w:pPr>
-      <w:r>
-        <w:t>Get ssh key</w:t>
-      </w:r>
-    </w:p>
-    <w:p>
-      <w:r>
-        <w:t xml:space="preserve">Ls -/.ssh    </w:t>
-      </w:r>
-      <w:r>
-        <w:sym w:font="Wingdings" w:char="F0DF"/>
-      </w:r>
-      <w:r>
-        <w:t xml:space="preserve"> tells you if you have SSH key. </w:t>
-      </w:r>
-    </w:p>
-    <w:p>
-      <w:r>
-        <w:t>Add more steps here later</w:t>
-      </w:r>
-    </w:p>
-    <w:p/>
-    <w:p>
-      <w:pPr>
-        <w:ind w:left="720" w:hanging="360"/>
-      </w:pPr>
-      <w:r>
-        <w:t>Pull Files for Fiscal-Futures-Topics.</w:t>
-      </w:r>
-    </w:p>
-    <w:p>
-      <w:pPr>
-        <w:ind w:left="720" w:hanging="360"/>
-      </w:pPr>
-    </w:p>
-    <w:p>
-      <w:pPr>
-        <w:ind w:left="720" w:hanging="360"/>
-      </w:pPr>
-    </w:p>
-    <w:p>
-      <w:pPr>
-        <w:ind w:left="720" w:hanging="360"/>
-      </w:pPr>
+      <w:hyperlink r:id="rId5" w:history="1">
+        <w:r>
+          <w:rPr>
+            <w:rStyle w:val="Hyperlink"/>
+          </w:rPr>
+          <w:t>Download</w:t>
+        </w:r>
+        <w:r>
+          <w:rPr>
+            <w:rStyle w:val="Hyperlink"/>
+          </w:rPr>
+          <w:t xml:space="preserve"> R</w:t>
+        </w:r>
+        <w:r>
+          <w:rPr>
+            <w:rStyle w:val="Hyperlink"/>
+          </w:rPr>
+          <w:t xml:space="preserve"> &amp; Rstudio</w:t>
+        </w:r>
+      </w:hyperlink>
+      <w:r>
+        <w:t xml:space="preserve"> </w:t>
+      </w:r>
+      <w:r>
+        <w:t xml:space="preserve">(or Positron) </w:t>
+      </w:r>
+      <w:r>
+        <w:t>onto your computer</w:t>
+      </w:r>
+      <w:r>
+        <w:t xml:space="preserve">. </w:t>
+      </w:r>
     </w:p>
     <w:p>
       <w:pPr>
         <w:pStyle w:val="ListParagraph"/>
         <w:numPr>
           <w:ilvl w:val="0"/>
-          <w:numId w:val="1"/>
+          <w:numId w:val="4"/>
         </w:numPr>
       </w:pPr>
-      <w:r>
-        <w:t>Move FOIA-ed files from GOMB into Fiscal-Future-Topics/inputs/</w:t>
-      </w:r>
-      <w:proofErr w:type="spellStart"/>
-      <w:r>
-        <w:t>ioc_data_received</w:t>
-      </w:r>
-      <w:proofErr w:type="spellEnd"/>
-      <w:r>
-        <w:t>/ expenditures or the revenues folder</w:t>
-      </w:r>
-      <w:r>
-        <w:t>.</w:t>
+      <w:hyperlink r:id="rId6" w:history="1">
+        <w:r>
+          <w:rPr>
+            <w:rStyle w:val="Hyperlink"/>
+          </w:rPr>
+          <w:t>Download Git</w:t>
+        </w:r>
+      </w:hyperlink>
+      <w:r>
+        <w:t xml:space="preserve"> so your computer can talk to </w:t>
+      </w:r>
+      <w:r>
+        <w:t>GitHub</w:t>
+      </w:r>
+      <w:r>
+        <w:t xml:space="preserve">. </w:t>
       </w:r>
     </w:p>
     <w:p>
@@ -128,14 +90,281 @@
         <w:pStyle w:val="ListParagraph"/>
         <w:numPr>
           <w:ilvl w:val="0"/>
-          <w:numId w:val="1"/>
+          <w:numId w:val="4"/>
         </w:numPr>
       </w:pPr>
       <w:r>
+        <w:t>Have a GitHub Account</w:t>
+      </w:r>
+      <w:r>
+        <w:t xml:space="preserve"> (if you are going to be editing the website or in charge of the IGPA page)</w:t>
+      </w:r>
+      <w:r>
+        <w:t xml:space="preserve">. </w:t>
+      </w:r>
+    </w:p>
+    <w:p>
+      <w:pPr>
+        <w:pStyle w:val="ListParagraph"/>
+        <w:numPr>
+          <w:ilvl w:val="0"/>
+          <w:numId w:val="4"/>
+        </w:numPr>
+      </w:pPr>
+      <w:r>
+        <w:t>Go to Fiscal-Futures project and click the green “&lt; &gt; Code” button and get the project link to join your computer and GitHub.</w:t>
+      </w:r>
+    </w:p>
+    <w:p>
+      <w:pPr>
+        <w:pStyle w:val="ListParagraph"/>
+        <w:numPr>
+          <w:ilvl w:val="1"/>
+          <w:numId w:val="4"/>
+        </w:numPr>
+      </w:pPr>
+      <w:r>
+        <w:t xml:space="preserve">HTTPS link is fine and easiest if you are only pulling the data. If you want to push updates and modify the website, you will most likely need the SSH password connected key and connection method. </w:t>
+      </w:r>
+      <w:hyperlink r:id="rId7" w:history="1">
+        <w:r>
+          <w:rPr>
+            <w:rStyle w:val="Hyperlink"/>
+          </w:rPr>
+          <w:t>There are steps to this online</w:t>
+        </w:r>
+      </w:hyperlink>
+      <w:r>
+        <w:t xml:space="preserve"> that can be followed (that’s how I learned how to do it and have to re-google it every time I’ve had to set it up).</w:t>
+      </w:r>
+    </w:p>
+    <w:p>
+      <w:pPr>
+        <w:ind w:left="720" w:hanging="360"/>
+      </w:pPr>
+      <w:r>
+        <w:drawing>
+          <wp:inline distT="0" distB="0" distL="0" distR="0" wp14:anchorId="4796F2EE" wp14:editId="73718283">
+            <wp:extent cx="5943600" cy="2484755"/>
+            <wp:effectExtent l="0" t="0" r="0" b="0"/>
+            <wp:docPr id="1847415474" name="Picture 1"/>
+            <wp:cNvGraphicFramePr>
+              <a:graphicFrameLocks xmlns:a="http://schemas.openxmlformats.org/drawingml/2006/main" noChangeAspect="1"/>
+            </wp:cNvGraphicFramePr>
+            <a:graphic xmlns:a="http://schemas.openxmlformats.org/drawingml/2006/main">
+              <a:graphicData uri="http://schemas.openxmlformats.org/drawingml/2006/picture">
+                <pic:pic xmlns:pic="http://schemas.openxmlformats.org/drawingml/2006/picture">
+                  <pic:nvPicPr>
+                    <pic:cNvPr id="1847415474" name=""/>
+                    <pic:cNvPicPr/>
+                  </pic:nvPicPr>
+                  <pic:blipFill>
+                    <a:blip r:embed="rId8"/>
+                    <a:stretch>
+                      <a:fillRect/>
+                    </a:stretch>
+                  </pic:blipFill>
+                  <pic:spPr>
+                    <a:xfrm>
+                      <a:off x="0" y="0"/>
+                      <a:ext cx="5943600" cy="2484755"/>
+                    </a:xfrm>
+                    <a:prstGeom prst="rect">
+                      <a:avLst/>
+                    </a:prstGeom>
+                  </pic:spPr>
+                </pic:pic>
+              </a:graphicData>
+            </a:graphic>
+          </wp:inline>
+        </w:drawing>
+      </w:r>
+    </w:p>
+    <w:p>
+      <w:pPr>
+        <w:pStyle w:val="ListParagraph"/>
+        <w:numPr>
+          <w:ilvl w:val="0"/>
+          <w:numId w:val="4"/>
+        </w:numPr>
+      </w:pPr>
+      <w:r>
+        <w:t>Open RStudio</w:t>
+      </w:r>
+      <w:r>
+        <w:t xml:space="preserve">. File &gt; New Project &gt; Version Control &gt; Git &gt; </w:t>
+      </w:r>
+      <w:r>
+        <w:t xml:space="preserve">Choose folder location for the project. </w:t>
+      </w:r>
+      <w:r>
+        <w:t xml:space="preserve">paste in the link from </w:t>
+      </w:r>
+      <w:r>
+        <w:t>GitHub</w:t>
+      </w:r>
+      <w:r>
+        <w:t>.</w:t>
+      </w:r>
+    </w:p>
+    <w:p>
+      <w:r>
+        <w:lastRenderedPageBreak/>
+        <w:drawing>
+          <wp:inline distT="0" distB="0" distL="0" distR="0" wp14:anchorId="13F98284" wp14:editId="2D72FC5C">
+            <wp:extent cx="5943600" cy="4025900"/>
+            <wp:effectExtent l="0" t="0" r="0" b="0"/>
+            <wp:docPr id="1908080728" name="Picture 1"/>
+            <wp:cNvGraphicFramePr>
+              <a:graphicFrameLocks xmlns:a="http://schemas.openxmlformats.org/drawingml/2006/main" noChangeAspect="1"/>
+            </wp:cNvGraphicFramePr>
+            <a:graphic xmlns:a="http://schemas.openxmlformats.org/drawingml/2006/main">
+              <a:graphicData uri="http://schemas.openxmlformats.org/drawingml/2006/picture">
+                <pic:pic xmlns:pic="http://schemas.openxmlformats.org/drawingml/2006/picture">
+                  <pic:nvPicPr>
+                    <pic:cNvPr id="1908080728" name=""/>
+                    <pic:cNvPicPr/>
+                  </pic:nvPicPr>
+                  <pic:blipFill>
+                    <a:blip r:embed="rId9"/>
+                    <a:stretch>
+                      <a:fillRect/>
+                    </a:stretch>
+                  </pic:blipFill>
+                  <pic:spPr>
+                    <a:xfrm>
+                      <a:off x="0" y="0"/>
+                      <a:ext cx="5943600" cy="4025900"/>
+                    </a:xfrm>
+                    <a:prstGeom prst="rect">
+                      <a:avLst/>
+                    </a:prstGeom>
+                  </pic:spPr>
+                </pic:pic>
+              </a:graphicData>
+            </a:graphic>
+          </wp:inline>
+        </w:drawing>
+      </w:r>
+    </w:p>
+    <w:p/>
+    <w:p>
+      <w:pPr>
+        <w:pStyle w:val="Title"/>
+        <w:rPr>
+          <w:sz w:val="48"/>
+          <w:szCs w:val="48"/>
+        </w:rPr>
+      </w:pPr>
+      <w:r>
+        <w:rPr>
+          <w:sz w:val="48"/>
+          <w:szCs w:val="48"/>
+        </w:rPr>
+        <w:t>How to update the Fiscal Future GitHub Data</w:t>
+      </w:r>
+    </w:p>
+    <w:p>
+      <w:pPr>
+        <w:pStyle w:val="ListParagraph"/>
+        <w:numPr>
+          <w:ilvl w:val="0"/>
+          <w:numId w:val="4"/>
+        </w:numPr>
+      </w:pPr>
+      <w:r>
+        <w:t xml:space="preserve">Refresh files on your computer by Using Git &gt; Pull. </w:t>
+      </w:r>
+    </w:p>
+    <w:p>
+      <w:pPr>
+        <w:pStyle w:val="ListParagraph"/>
+      </w:pPr>
+      <w:r>
+        <w:drawing>
+          <wp:inline distT="0" distB="0" distL="0" distR="0" wp14:anchorId="1EE7C5A6" wp14:editId="66ADD333">
+            <wp:extent cx="5943600" cy="3015615"/>
+            <wp:effectExtent l="0" t="0" r="0" b="0"/>
+            <wp:docPr id="631157964" name="Picture 1"/>
+            <wp:cNvGraphicFramePr>
+              <a:graphicFrameLocks xmlns:a="http://schemas.openxmlformats.org/drawingml/2006/main" noChangeAspect="1"/>
+            </wp:cNvGraphicFramePr>
+            <a:graphic xmlns:a="http://schemas.openxmlformats.org/drawingml/2006/main">
+              <a:graphicData uri="http://schemas.openxmlformats.org/drawingml/2006/picture">
+                <pic:pic xmlns:pic="http://schemas.openxmlformats.org/drawingml/2006/picture">
+                  <pic:nvPicPr>
+                    <pic:cNvPr id="631157964" name=""/>
+                    <pic:cNvPicPr/>
+                  </pic:nvPicPr>
+                  <pic:blipFill>
+                    <a:blip r:embed="rId10"/>
+                    <a:stretch>
+                      <a:fillRect/>
+                    </a:stretch>
+                  </pic:blipFill>
+                  <pic:spPr>
+                    <a:xfrm>
+                      <a:off x="0" y="0"/>
+                      <a:ext cx="5943600" cy="3015615"/>
+                    </a:xfrm>
+                    <a:prstGeom prst="rect">
+                      <a:avLst/>
+                    </a:prstGeom>
+                  </pic:spPr>
+                </pic:pic>
+              </a:graphicData>
+            </a:graphic>
+          </wp:inline>
+        </w:drawing>
+      </w:r>
+    </w:p>
+    <w:p>
+      <w:pPr>
+        <w:pStyle w:val="ListParagraph"/>
+        <w:numPr>
+          <w:ilvl w:val="0"/>
+          <w:numId w:val="4"/>
+        </w:numPr>
+      </w:pPr>
+      <w:r>
+        <w:lastRenderedPageBreak/>
+        <w:t xml:space="preserve">Move </w:t>
+      </w:r>
+      <w:r>
+        <w:t xml:space="preserve">raw </w:t>
+      </w:r>
+      <w:r>
+        <w:t>FOIA-ed files from GOMB into Fiscal-Future</w:t>
+      </w:r>
+      <w:r>
+        <w:t>s</w:t>
+      </w:r>
+      <w:r>
+        <w:t>/inputs/ioc_data_received/ expenditures or the revenues folder</w:t>
+      </w:r>
+      <w:r>
+        <w:t>.</w:t>
+      </w:r>
+    </w:p>
+    <w:p>
+      <w:pPr>
+        <w:pStyle w:val="ListParagraph"/>
+        <w:numPr>
+          <w:ilvl w:val="0"/>
+          <w:numId w:val="4"/>
+        </w:numPr>
+      </w:pPr>
+      <w:r>
         <w:t xml:space="preserve">Create folder in </w:t>
       </w:r>
       <w:r>
-        <w:t>Fiscal Futures IGPA/Fiscal-Future-Topics/data/</w:t>
+        <w:t>Fiscal Futures IGPA/Fiscal-Future</w:t>
+      </w:r>
+      <w:r>
+        <w:t>s</w:t>
+      </w:r>
+      <w:r>
+        <w:t>/data/</w:t>
       </w:r>
       <w:r>
         <w:t xml:space="preserve">NEW FOLDER </w:t>
@@ -156,23 +385,7 @@
         <w:t xml:space="preserve"> in code</w:t>
       </w:r>
       <w:r>
-        <w:t xml:space="preserve"> can find the correct folder in code files and </w:t>
-      </w:r>
-      <w:proofErr w:type="spellStart"/>
-      <w:r>
-        <w:t>rev_temp</w:t>
-      </w:r>
-      <w:proofErr w:type="spellEnd"/>
-      <w:r>
-        <w:t xml:space="preserve"> and </w:t>
-      </w:r>
-      <w:proofErr w:type="spellStart"/>
-      <w:r>
-        <w:t>exp_temp</w:t>
-      </w:r>
-      <w:proofErr w:type="spellEnd"/>
-      <w:r>
-        <w:t xml:space="preserve"> files that will be created for the new fiscal year. </w:t>
+        <w:t xml:space="preserve"> can find the correct folder in code files and rev_temp and exp_temp files that will be created for the new fiscal year. </w:t>
       </w:r>
     </w:p>
     <w:p>
@@ -180,7 +393,7 @@
         <w:pStyle w:val="ListParagraph"/>
         <w:numPr>
           <w:ilvl w:val="0"/>
-          <w:numId w:val="1"/>
+          <w:numId w:val="4"/>
         </w:numPr>
       </w:pPr>
       <w:r>
@@ -191,19 +404,10 @@
           <w:b/>
           <w:bCs/>
         </w:rPr>
-        <w:t>code-</w:t>
-      </w:r>
-      <w:proofErr w:type="spellStart"/>
-      <w:r>
-        <w:rPr>
-          <w:b/>
-          <w:bCs/>
-        </w:rPr>
-        <w:t>cleaning.qmd</w:t>
-      </w:r>
-      <w:proofErr w:type="spellEnd"/>
-      <w:r>
-        <w:t xml:space="preserve"> in Fiscal-Futures-Topics R project.</w:t>
+        <w:t>code-cleaning.qmd</w:t>
+      </w:r>
+      <w:r>
+        <w:t xml:space="preserve"> in Fiscal-Futures R project.</w:t>
       </w:r>
       <w:r>
         <w:t xml:space="preserve"> NOTE you need to manually run the chunks. They are set to EVAL == FALSE. </w:t>
@@ -215,23 +419,10 @@
         <w:t>There is one chunk called “</w:t>
       </w:r>
       <w:r>
-        <w:t>historic-create-rev-csv-</w:t>
-      </w:r>
-      <w:proofErr w:type="spellStart"/>
-      <w:r>
-        <w:t>dtafiles</w:t>
-      </w:r>
-      <w:proofErr w:type="spellEnd"/>
-      <w:r>
-        <w:t xml:space="preserve">” that you do not need to run. It is for </w:t>
-      </w:r>
-      <w:proofErr w:type="gramStart"/>
-      <w:r>
-        <w:t>historic</w:t>
-      </w:r>
-      <w:proofErr w:type="gramEnd"/>
-      <w:r>
-        <w:t xml:space="preserve"> documentation only. </w:t>
+        <w:t>historic-create-rev-csv-dtafiles</w:t>
+      </w:r>
+      <w:r>
+        <w:t xml:space="preserve">” that you do not need to run. It is for historic documentation only. </w:t>
       </w:r>
     </w:p>
     <w:p>
@@ -291,15 +482,7 @@
         <w:t>d</w:t>
       </w:r>
       <w:r>
-        <w:t xml:space="preserve"> new and reused funds, agencies, organizations, etc.</w:t>
-      </w:r>
-      <w:proofErr w:type="gramStart"/>
-      <w:r>
-        <w:t xml:space="preserve"> anything</w:t>
-      </w:r>
-      <w:proofErr w:type="gramEnd"/>
-      <w:r>
-        <w:t xml:space="preserve"> that has changed from previous fiscal years.</w:t>
+        <w:t xml:space="preserve"> new and reused funds, agencies, organizations, etc. anything that has changed from previous fiscal years.</w:t>
       </w:r>
     </w:p>
     <w:p>
@@ -311,15 +494,7 @@
         </w:numPr>
       </w:pPr>
       <w:r>
-        <w:t xml:space="preserve">Make a document or show the research team somehow the new funds or revenue sources so that decisions can be made on </w:t>
-      </w:r>
-      <w:proofErr w:type="gramStart"/>
-      <w:r>
-        <w:t>if</w:t>
-      </w:r>
-      <w:proofErr w:type="gramEnd"/>
-      <w:r>
-        <w:t xml:space="preserve"> they should be included in the fiscal gap or not. </w:t>
+        <w:t xml:space="preserve">Make a document or show the research team somehow the new funds or revenue sources so that decisions can be made on if they should be included in the fiscal gap or not. </w:t>
       </w:r>
     </w:p>
     <w:p>
@@ -330,38 +505,14 @@
           <w:numId w:val="1"/>
         </w:numPr>
       </w:pPr>
-      <w:proofErr w:type="gramStart"/>
-      <w:r>
-        <w:lastRenderedPageBreak/>
-        <w:t>Usually</w:t>
-      </w:r>
-      <w:proofErr w:type="gramEnd"/>
-      <w:r>
-        <w:t xml:space="preserve"> a table of the output from code-</w:t>
-      </w:r>
-      <w:proofErr w:type="spellStart"/>
-      <w:r>
-        <w:t>cleaning.qmd</w:t>
-      </w:r>
-      <w:proofErr w:type="spellEnd"/>
-      <w:r>
-        <w:t xml:space="preserve"> is screenshotted or shown somehow to the group and the RA searches what the funds are supposed to be used for. Add column for if it is a name change, not new, new. Etc. Identify what rev source group it should be included </w:t>
-      </w:r>
-      <w:proofErr w:type="gramStart"/>
-      <w:r>
-        <w:t>as</w:t>
-      </w:r>
-      <w:proofErr w:type="gramEnd"/>
-      <w:r>
-        <w:t xml:space="preserve">. See past examples </w:t>
-      </w:r>
-      <w:proofErr w:type="gramStart"/>
-      <w:r>
-        <w:t>if</w:t>
-      </w:r>
-      <w:proofErr w:type="gramEnd"/>
-      <w:r>
-        <w:t xml:space="preserve"> confused!</w:t>
+      <w:r>
+        <w:t>Usually a table of the output from code-cleaning.qmd is screenshotted or shown somehow to the group and the RA searches what the funds are supposed to be used for. Add column for if it is a name change, not new, new. Etc. Identify what rev source group it should be included as.</w:t>
+      </w:r>
+      <w:r>
+        <w:t xml:space="preserve"> </w:t>
+      </w:r>
+      <w:r>
+        <w:t xml:space="preserve"> See past examples if confused!</w:t>
       </w:r>
     </w:p>
     <w:p>
@@ -389,7 +540,7 @@
         <w:pStyle w:val="ListParagraph"/>
         <w:numPr>
           <w:ilvl w:val="0"/>
-          <w:numId w:val="1"/>
+          <w:numId w:val="4"/>
         </w:numPr>
       </w:pPr>
       <w:r>
@@ -428,27 +579,11 @@
         <w:pStyle w:val="ListParagraph"/>
         <w:numPr>
           <w:ilvl w:val="0"/>
-          <w:numId w:val="1"/>
+          <w:numId w:val="4"/>
         </w:numPr>
       </w:pPr>
       <w:r>
-        <w:t xml:space="preserve">Update </w:t>
-      </w:r>
-      <w:proofErr w:type="spellStart"/>
-      <w:r>
-        <w:t>current_year</w:t>
-      </w:r>
-      <w:proofErr w:type="spellEnd"/>
-      <w:r>
-        <w:t xml:space="preserve"> in </w:t>
-      </w:r>
-      <w:proofErr w:type="spellStart"/>
-      <w:r>
-        <w:t>Everything_changepensions.qmd</w:t>
-      </w:r>
-      <w:proofErr w:type="spellEnd"/>
-      <w:r>
-        <w:t xml:space="preserve"> file </w:t>
+        <w:t xml:space="preserve">Update current_year in Everything_changepensions.qmd file </w:t>
       </w:r>
     </w:p>
     <w:sectPr>
@@ -664,11 +799,304 @@
       </w:rPr>
     </w:lvl>
   </w:abstractNum>
+  <w:abstractNum w:abstractNumId="2" w15:restartNumberingAfterBreak="0">
+    <w:nsid w:val="1F0B14C9"/>
+    <w:multiLevelType w:val="hybridMultilevel"/>
+    <w:tmpl w:val="13D05744"/>
+    <w:lvl w:ilvl="0" w:tplc="0409000F">
+      <w:start w:val="1"/>
+      <w:numFmt w:val="decimal"/>
+      <w:lvlText w:val="%1."/>
+      <w:lvlJc w:val="left"/>
+      <w:pPr>
+        <w:ind w:left="1080" w:hanging="360"/>
+      </w:pPr>
+    </w:lvl>
+    <w:lvl w:ilvl="1" w:tplc="04090019" w:tentative="1">
+      <w:start w:val="1"/>
+      <w:numFmt w:val="lowerLetter"/>
+      <w:lvlText w:val="%2."/>
+      <w:lvlJc w:val="left"/>
+      <w:pPr>
+        <w:ind w:left="1800" w:hanging="360"/>
+      </w:pPr>
+    </w:lvl>
+    <w:lvl w:ilvl="2" w:tplc="0409001B" w:tentative="1">
+      <w:start w:val="1"/>
+      <w:numFmt w:val="lowerRoman"/>
+      <w:lvlText w:val="%3."/>
+      <w:lvlJc w:val="right"/>
+      <w:pPr>
+        <w:ind w:left="2520" w:hanging="180"/>
+      </w:pPr>
+    </w:lvl>
+    <w:lvl w:ilvl="3" w:tplc="0409000F" w:tentative="1">
+      <w:start w:val="1"/>
+      <w:numFmt w:val="decimal"/>
+      <w:lvlText w:val="%4."/>
+      <w:lvlJc w:val="left"/>
+      <w:pPr>
+        <w:ind w:left="3240" w:hanging="360"/>
+      </w:pPr>
+    </w:lvl>
+    <w:lvl w:ilvl="4" w:tplc="04090019" w:tentative="1">
+      <w:start w:val="1"/>
+      <w:numFmt w:val="lowerLetter"/>
+      <w:lvlText w:val="%5."/>
+      <w:lvlJc w:val="left"/>
+      <w:pPr>
+        <w:ind w:left="3960" w:hanging="360"/>
+      </w:pPr>
+    </w:lvl>
+    <w:lvl w:ilvl="5" w:tplc="0409001B" w:tentative="1">
+      <w:start w:val="1"/>
+      <w:numFmt w:val="lowerRoman"/>
+      <w:lvlText w:val="%6."/>
+      <w:lvlJc w:val="right"/>
+      <w:pPr>
+        <w:ind w:left="4680" w:hanging="180"/>
+      </w:pPr>
+    </w:lvl>
+    <w:lvl w:ilvl="6" w:tplc="0409000F" w:tentative="1">
+      <w:start w:val="1"/>
+      <w:numFmt w:val="decimal"/>
+      <w:lvlText w:val="%7."/>
+      <w:lvlJc w:val="left"/>
+      <w:pPr>
+        <w:ind w:left="5400" w:hanging="360"/>
+      </w:pPr>
+    </w:lvl>
+    <w:lvl w:ilvl="7" w:tplc="04090019" w:tentative="1">
+      <w:start w:val="1"/>
+      <w:numFmt w:val="lowerLetter"/>
+      <w:lvlText w:val="%8."/>
+      <w:lvlJc w:val="left"/>
+      <w:pPr>
+        <w:ind w:left="6120" w:hanging="360"/>
+      </w:pPr>
+    </w:lvl>
+    <w:lvl w:ilvl="8" w:tplc="0409001B" w:tentative="1">
+      <w:start w:val="1"/>
+      <w:numFmt w:val="lowerRoman"/>
+      <w:lvlText w:val="%9."/>
+      <w:lvlJc w:val="right"/>
+      <w:pPr>
+        <w:ind w:left="6840" w:hanging="180"/>
+      </w:pPr>
+    </w:lvl>
+  </w:abstractNum>
+  <w:abstractNum w:abstractNumId="3" w15:restartNumberingAfterBreak="0">
+    <w:nsid w:val="56D0315F"/>
+    <w:multiLevelType w:val="hybridMultilevel"/>
+    <w:tmpl w:val="A2309826"/>
+    <w:lvl w:ilvl="0" w:tplc="FBB6072C">
+      <w:numFmt w:val="bullet"/>
+      <w:lvlText w:val="-"/>
+      <w:lvlJc w:val="left"/>
+      <w:pPr>
+        <w:ind w:left="720" w:hanging="360"/>
+      </w:pPr>
+      <w:rPr>
+        <w:rFonts w:ascii="Times New Roman" w:eastAsiaTheme="minorHAnsi" w:hAnsi="Times New Roman" w:cs="Times New Roman" w:hint="default"/>
+      </w:rPr>
+    </w:lvl>
+    <w:lvl w:ilvl="1" w:tplc="04090003" w:tentative="1">
+      <w:start w:val="1"/>
+      <w:numFmt w:val="bullet"/>
+      <w:lvlText w:val="o"/>
+      <w:lvlJc w:val="left"/>
+      <w:pPr>
+        <w:ind w:left="1440" w:hanging="360"/>
+      </w:pPr>
+      <w:rPr>
+        <w:rFonts w:ascii="Courier New" w:hAnsi="Courier New" w:cs="Courier New" w:hint="default"/>
+      </w:rPr>
+    </w:lvl>
+    <w:lvl w:ilvl="2" w:tplc="04090005" w:tentative="1">
+      <w:start w:val="1"/>
+      <w:numFmt w:val="bullet"/>
+      <w:lvlText w:val=""/>
+      <w:lvlJc w:val="left"/>
+      <w:pPr>
+        <w:ind w:left="2160" w:hanging="360"/>
+      </w:pPr>
+      <w:rPr>
+        <w:rFonts w:ascii="Wingdings" w:hAnsi="Wingdings" w:hint="default"/>
+      </w:rPr>
+    </w:lvl>
+    <w:lvl w:ilvl="3" w:tplc="04090001" w:tentative="1">
+      <w:start w:val="1"/>
+      <w:numFmt w:val="bullet"/>
+      <w:lvlText w:val=""/>
+      <w:lvlJc w:val="left"/>
+      <w:pPr>
+        <w:ind w:left="2880" w:hanging="360"/>
+      </w:pPr>
+      <w:rPr>
+        <w:rFonts w:ascii="Symbol" w:hAnsi="Symbol" w:hint="default"/>
+      </w:rPr>
+    </w:lvl>
+    <w:lvl w:ilvl="4" w:tplc="04090003" w:tentative="1">
+      <w:start w:val="1"/>
+      <w:numFmt w:val="bullet"/>
+      <w:lvlText w:val="o"/>
+      <w:lvlJc w:val="left"/>
+      <w:pPr>
+        <w:ind w:left="3600" w:hanging="360"/>
+      </w:pPr>
+      <w:rPr>
+        <w:rFonts w:ascii="Courier New" w:hAnsi="Courier New" w:cs="Courier New" w:hint="default"/>
+      </w:rPr>
+    </w:lvl>
+    <w:lvl w:ilvl="5" w:tplc="04090005" w:tentative="1">
+      <w:start w:val="1"/>
+      <w:numFmt w:val="bullet"/>
+      <w:lvlText w:val=""/>
+      <w:lvlJc w:val="left"/>
+      <w:pPr>
+        <w:ind w:left="4320" w:hanging="360"/>
+      </w:pPr>
+      <w:rPr>
+        <w:rFonts w:ascii="Wingdings" w:hAnsi="Wingdings" w:hint="default"/>
+      </w:rPr>
+    </w:lvl>
+    <w:lvl w:ilvl="6" w:tplc="04090001" w:tentative="1">
+      <w:start w:val="1"/>
+      <w:numFmt w:val="bullet"/>
+      <w:lvlText w:val=""/>
+      <w:lvlJc w:val="left"/>
+      <w:pPr>
+        <w:ind w:left="5040" w:hanging="360"/>
+      </w:pPr>
+      <w:rPr>
+        <w:rFonts w:ascii="Symbol" w:hAnsi="Symbol" w:hint="default"/>
+      </w:rPr>
+    </w:lvl>
+    <w:lvl w:ilvl="7" w:tplc="04090003" w:tentative="1">
+      <w:start w:val="1"/>
+      <w:numFmt w:val="bullet"/>
+      <w:lvlText w:val="o"/>
+      <w:lvlJc w:val="left"/>
+      <w:pPr>
+        <w:ind w:left="5760" w:hanging="360"/>
+      </w:pPr>
+      <w:rPr>
+        <w:rFonts w:ascii="Courier New" w:hAnsi="Courier New" w:cs="Courier New" w:hint="default"/>
+      </w:rPr>
+    </w:lvl>
+    <w:lvl w:ilvl="8" w:tplc="04090005" w:tentative="1">
+      <w:start w:val="1"/>
+      <w:numFmt w:val="bullet"/>
+      <w:lvlText w:val=""/>
+      <w:lvlJc w:val="left"/>
+      <w:pPr>
+        <w:ind w:left="6480" w:hanging="360"/>
+      </w:pPr>
+      <w:rPr>
+        <w:rFonts w:ascii="Wingdings" w:hAnsi="Wingdings" w:hint="default"/>
+      </w:rPr>
+    </w:lvl>
+  </w:abstractNum>
+  <w:abstractNum w:abstractNumId="4" w15:restartNumberingAfterBreak="0">
+    <w:nsid w:val="59F26AAF"/>
+    <w:multiLevelType w:val="hybridMultilevel"/>
+    <w:tmpl w:val="28BC0800"/>
+    <w:lvl w:ilvl="0" w:tplc="0409000F">
+      <w:start w:val="1"/>
+      <w:numFmt w:val="decimal"/>
+      <w:lvlText w:val="%1."/>
+      <w:lvlJc w:val="left"/>
+      <w:pPr>
+        <w:ind w:left="1080" w:hanging="360"/>
+      </w:pPr>
+    </w:lvl>
+    <w:lvl w:ilvl="1" w:tplc="04090019">
+      <w:start w:val="1"/>
+      <w:numFmt w:val="lowerLetter"/>
+      <w:lvlText w:val="%2."/>
+      <w:lvlJc w:val="left"/>
+      <w:pPr>
+        <w:ind w:left="1800" w:hanging="360"/>
+      </w:pPr>
+    </w:lvl>
+    <w:lvl w:ilvl="2" w:tplc="0409001B" w:tentative="1">
+      <w:start w:val="1"/>
+      <w:numFmt w:val="lowerRoman"/>
+      <w:lvlText w:val="%3."/>
+      <w:lvlJc w:val="right"/>
+      <w:pPr>
+        <w:ind w:left="2520" w:hanging="180"/>
+      </w:pPr>
+    </w:lvl>
+    <w:lvl w:ilvl="3" w:tplc="0409000F" w:tentative="1">
+      <w:start w:val="1"/>
+      <w:numFmt w:val="decimal"/>
+      <w:lvlText w:val="%4."/>
+      <w:lvlJc w:val="left"/>
+      <w:pPr>
+        <w:ind w:left="3240" w:hanging="360"/>
+      </w:pPr>
+    </w:lvl>
+    <w:lvl w:ilvl="4" w:tplc="04090019" w:tentative="1">
+      <w:start w:val="1"/>
+      <w:numFmt w:val="lowerLetter"/>
+      <w:lvlText w:val="%5."/>
+      <w:lvlJc w:val="left"/>
+      <w:pPr>
+        <w:ind w:left="3960" w:hanging="360"/>
+      </w:pPr>
+    </w:lvl>
+    <w:lvl w:ilvl="5" w:tplc="0409001B" w:tentative="1">
+      <w:start w:val="1"/>
+      <w:numFmt w:val="lowerRoman"/>
+      <w:lvlText w:val="%6."/>
+      <w:lvlJc w:val="right"/>
+      <w:pPr>
+        <w:ind w:left="4680" w:hanging="180"/>
+      </w:pPr>
+    </w:lvl>
+    <w:lvl w:ilvl="6" w:tplc="0409000F" w:tentative="1">
+      <w:start w:val="1"/>
+      <w:numFmt w:val="decimal"/>
+      <w:lvlText w:val="%7."/>
+      <w:lvlJc w:val="left"/>
+      <w:pPr>
+        <w:ind w:left="5400" w:hanging="360"/>
+      </w:pPr>
+    </w:lvl>
+    <w:lvl w:ilvl="7" w:tplc="04090019" w:tentative="1">
+      <w:start w:val="1"/>
+      <w:numFmt w:val="lowerLetter"/>
+      <w:lvlText w:val="%8."/>
+      <w:lvlJc w:val="left"/>
+      <w:pPr>
+        <w:ind w:left="6120" w:hanging="360"/>
+      </w:pPr>
+    </w:lvl>
+    <w:lvl w:ilvl="8" w:tplc="0409001B" w:tentative="1">
+      <w:start w:val="1"/>
+      <w:numFmt w:val="lowerRoman"/>
+      <w:lvlText w:val="%9."/>
+      <w:lvlJc w:val="right"/>
+      <w:pPr>
+        <w:ind w:left="6840" w:hanging="180"/>
+      </w:pPr>
+    </w:lvl>
+  </w:abstractNum>
   <w:num w:numId="1" w16cid:durableId="1958828968">
     <w:abstractNumId w:val="0"/>
   </w:num>
   <w:num w:numId="2" w16cid:durableId="832140988">
     <w:abstractNumId w:val="1"/>
+  </w:num>
+  <w:num w:numId="3" w16cid:durableId="188957102">
+    <w:abstractNumId w:val="3"/>
+  </w:num>
+  <w:num w:numId="4" w16cid:durableId="671223040">
+    <w:abstractNumId w:val="4"/>
+  </w:num>
+  <w:num w:numId="5" w16cid:durableId="560409149">
+    <w:abstractNumId w:val="2"/>
   </w:num>
 </w:numbering>
 </file>
@@ -1286,7 +1714,6 @@
   <w:style w:type="character" w:default="1" w:styleId="DefaultParagraphFont">
     <w:name w:val="Default Paragraph Font"/>
     <w:uiPriority w:val="1"/>
-    <w:semiHidden/>
     <w:unhideWhenUsed/>
   </w:style>
   <w:style w:type="table" w:default="1" w:styleId="TableNormal">
@@ -1634,6 +2061,29 @@
       <w:smallCaps/>
       <w:color w:val="0F4761" w:themeColor="accent1" w:themeShade="BF"/>
       <w:spacing w:val="5"/>
+    </w:rPr>
+  </w:style>
+  <w:style w:type="character" w:styleId="Hyperlink">
+    <w:name w:val="Hyperlink"/>
+    <w:basedOn w:val="DefaultParagraphFont"/>
+    <w:uiPriority w:val="99"/>
+    <w:unhideWhenUsed/>
+    <w:rsid w:val="00211AD0"/>
+    <w:rPr>
+      <w:color w:val="467886" w:themeColor="hyperlink"/>
+      <w:u w:val="single"/>
+    </w:rPr>
+  </w:style>
+  <w:style w:type="character" w:styleId="UnresolvedMention">
+    <w:name w:val="Unresolved Mention"/>
+    <w:basedOn w:val="DefaultParagraphFont"/>
+    <w:uiPriority w:val="99"/>
+    <w:semiHidden/>
+    <w:unhideWhenUsed/>
+    <w:rsid w:val="00211AD0"/>
+    <w:rPr>
+      <w:color w:val="605E5C"/>
+      <w:shd w:val="clear" w:color="auto" w:fill="E1DFDD"/>
     </w:rPr>
   </w:style>
 </w:styles>

</xml_diff>